<commit_message>
feat(investor): simplify settlement report generation using settlement ID
Update the liquidated report endpoint to fetch only the most recent settlement record instead of filtering a large set by date. This change improves query efficiency by limiting results and ensures the report generation logic uses the specific settlement ID rather than a date string.
</commit_message>
<xml_diff>
--- a/apps/legal-docs-blueprints/templates/garantia_mobiliaria/garantia_mobiliaria-plural.docx
+++ b/apps/legal-docs-blueprints/templates/garantia_mobiliaria/garantia_mobiliaria-plural.docx
@@ -204,15 +204,7 @@
           <w:sz w:val="20"/>
           <w:szCs w:val="20"/>
         </w:rPr>
-        <w:t xml:space="preserve"> {edadAndres</w:t>
-      </w:r>
-      <w:r>
-        <w:rPr>
-          <w:rFonts w:eastAsia="Arial" w:cs="Arial" w:ascii="Arial" w:hAnsi="Arial"/>
-          <w:sz w:val="20"/>
-          <w:szCs w:val="20"/>
-        </w:rPr>
-        <w:t xml:space="preserve">} </w:t>
+        <w:t xml:space="preserve"> {edadAndres} </w:t>
       </w:r>
       <w:r>
         <w:rPr>
@@ -284,11 +276,11 @@
           <w:effect w:val="none"/>
           <w:shd w:fill="FFFFFF" w:val="clear"/>
         </w:rPr>
-        <w:t>CUBE INVESTMENTS, SOCIEDAD ANÓ</w:t>
-      </w:r>
-      <w:r>
-        <w:rPr>
-          <w:rFonts w:eastAsia="Arial" w:cs="Arial" w:ascii="Arial" w:hAnsi="Arial"/>
+        <w:t xml:space="preserve">CUBE INVESTMENTS, SOCIEDAD </w:t>
+      </w:r>
+      <w:r>
+        <w:rPr>
+          <w:rFonts w:eastAsia="Arial" w:cs="Arial" w:ascii="Arial;sans-serif" w:hAnsi="Arial;sans-serif"/>
           <w:b/>
           <w:i w:val="false"/>
           <w:caps w:val="false"/>
@@ -298,11 +290,11 @@
           <w:color w:val="000000"/>
           <w:sz w:val="20"/>
           <w:szCs w:val="20"/>
-          <w:u w:val="none"/>
+          <w:u w:val="single"/>
           <w:effect w:val="none"/>
           <w:shd w:fill="FFFFFF" w:val="clear"/>
         </w:rPr>
-        <w:t>Andres</w:t>
+        <w:t>ANÓ</w:t>
       </w:r>
       <w:r>
         <w:rPr>
@@ -316,7 +308,7 @@
           <w:color w:val="000000"/>
           <w:sz w:val="20"/>
           <w:szCs w:val="20"/>
-          <w:u w:val="none"/>
+          <w:u w:val="single"/>
           <w:effect w:val="none"/>
           <w:shd w:fill="FFFFFF" w:val="clear"/>
         </w:rPr>

</xml_diff>